<commit_message>
Final commit for module 7
</commit_message>
<xml_diff>
--- a/module-7/Donohue-M7-Assignment-7_2.docx
+++ b/module-7/Donohue-M7-Assignment-7_2.docx
@@ -442,6 +442,7 @@
       <w:r>
         <w:rPr>
           <w:rFonts w:ascii="Times New Roman" w:hAnsi="Times New Roman" w:cs="Times New Roman"/>
+          <w:noProof/>
           <w:sz w:val="24"/>
           <w:szCs w:val="24"/>
         </w:rPr>
@@ -522,6 +523,7 @@
       <w:r>
         <w:rPr>
           <w:rFonts w:ascii="Times New Roman" w:hAnsi="Times New Roman" w:cs="Times New Roman"/>
+          <w:noProof/>
           <w:sz w:val="24"/>
           <w:szCs w:val="24"/>
         </w:rPr>
@@ -610,6 +612,7 @@
       <w:r>
         <w:rPr>
           <w:rFonts w:ascii="Times New Roman" w:hAnsi="Times New Roman" w:cs="Times New Roman"/>
+          <w:noProof/>
           <w:sz w:val="24"/>
           <w:szCs w:val="24"/>
         </w:rPr>
@@ -698,6 +701,7 @@
       <w:r>
         <w:rPr>
           <w:rFonts w:ascii="Times New Roman" w:hAnsi="Times New Roman" w:cs="Times New Roman"/>
+          <w:noProof/>
           <w:sz w:val="24"/>
           <w:szCs w:val="24"/>
         </w:rPr>
@@ -779,6 +783,7 @@
       <w:r>
         <w:rPr>
           <w:rFonts w:ascii="Times New Roman" w:hAnsi="Times New Roman" w:cs="Times New Roman"/>
+          <w:noProof/>
           <w:sz w:val="24"/>
           <w:szCs w:val="24"/>
         </w:rPr>
@@ -859,6 +864,7 @@
       <w:r>
         <w:rPr>
           <w:rFonts w:ascii="Times New Roman" w:hAnsi="Times New Roman" w:cs="Times New Roman"/>
+          <w:noProof/>
           <w:sz w:val="24"/>
           <w:szCs w:val="24"/>
         </w:rPr>
@@ -959,6 +965,7 @@
       <w:r>
         <w:rPr>
           <w:rFonts w:ascii="Times New Roman" w:hAnsi="Times New Roman" w:cs="Times New Roman"/>
+          <w:noProof/>
           <w:sz w:val="24"/>
           <w:szCs w:val="24"/>
         </w:rPr>
@@ -1022,27 +1029,19 @@
     <w:p/>
     <w:p/>
     <w:p>
-      <w:proofErr w:type="spellStart"/>
       <w:r>
         <w:lastRenderedPageBreak/>
-        <w:t>Github</w:t>
-      </w:r>
-      <w:proofErr w:type="spellEnd"/>
-      <w:r>
-        <w:t xml:space="preserve"> Upload</w:t>
+        <w:t>Github Upload</w:t>
       </w:r>
       <w:r>
         <w:br/>
       </w:r>
       <w:r>
-        <w:rPr>
-          <w:noProof/>
-        </w:rPr>
         <w:drawing>
-          <wp:inline distT="0" distB="0" distL="0" distR="0" wp14:anchorId="7F7B6189" wp14:editId="2DDA4EEA">
-            <wp:extent cx="5943600" cy="3756660"/>
-            <wp:effectExtent l="0" t="0" r="0" b="0"/>
-            <wp:docPr id="334112075" name="Picture 1"/>
+          <wp:inline distT="0" distB="0" distL="0" distR="0" wp14:anchorId="4769A046" wp14:editId="0AEABF5E">
+            <wp:extent cx="5943600" cy="3713480"/>
+            <wp:effectExtent l="0" t="0" r="0" b="1270"/>
+            <wp:docPr id="110759911" name="Picture 1"/>
             <wp:cNvGraphicFramePr>
               <a:graphicFrameLocks xmlns:a="http://schemas.openxmlformats.org/drawingml/2006/main" noChangeAspect="1"/>
             </wp:cNvGraphicFramePr>
@@ -1050,7 +1049,7 @@
               <a:graphicData uri="http://schemas.openxmlformats.org/drawingml/2006/picture">
                 <pic:pic xmlns:pic="http://schemas.openxmlformats.org/drawingml/2006/picture">
                   <pic:nvPicPr>
-                    <pic:cNvPr id="334112075" name=""/>
+                    <pic:cNvPr id="110759911" name=""/>
                     <pic:cNvPicPr/>
                   </pic:nvPicPr>
                   <pic:blipFill>
@@ -1062,7 +1061,7 @@
                   <pic:spPr>
                     <a:xfrm>
                       <a:off x="0" y="0"/>
-                      <a:ext cx="5943600" cy="3756660"/>
+                      <a:ext cx="5943600" cy="3713480"/>
                     </a:xfrm>
                     <a:prstGeom prst="rect">
                       <a:avLst/>
@@ -3238,6 +3237,7 @@
   <w:style w:type="character" w:default="1" w:styleId="DefaultParagraphFont">
     <w:name w:val="Default Paragraph Font"/>
     <w:uiPriority w:val="1"/>
+    <w:semiHidden/>
     <w:unhideWhenUsed/>
   </w:style>
   <w:style w:type="table" w:default="1" w:styleId="TableNormal">

</xml_diff>